<commit_message>
Konzept-Word: Uebersicht der offenen Punkte nach vorn
Die roten Stellen waren ueber vierzehn Seiten verteilt - auf der ersten
Seite stand genau eine, der Rest kam erst spaeter. Wer das Dokument
aufschlaegt, sieht dadurch nicht, was offen ist.

Neu direkt nach der Legende: eine Tabelle mit allen 21 offenen Punkten,
je mit Abschnittsnummer und Zustaendigkeit. Rot bleibt rot, aber man muss
nicht mehr blaettern.

Rote Textlaeufe damit von 43 auf 108. Blau unveraendert bei 250 - das ist
der Anteil, der aus diesem Gespraech stammt, rund ein Drittel des
Dokuments.

Co-Authored-By: Claude Opus 5 <noreply@anthropic.com>
Claude-Session: https://claude.ai/code/session_01LTzG2LQUXUCGRg9kWDQJKD
</commit_message>
<xml_diff>
--- a/studie/word/Webgewerk-Unternehmenskonzept.docx
+++ b/studie/word/Webgewerk-Unternehmenskonzept.docx
@@ -164,6 +164,1841 @@
       <w:pPr>
         <w:spacing w:after="120"/>
       </w:pPr>
+    </w:p>
+    <w:p>
+      <w:pPr>
+        <w:pStyle w:val="Heading1"/>
+        <w:spacing w:after="120" w:before="320"/>
+      </w:pPr>
+      <w:r>
+        <w:rPr>
+          <w:color w:val="C00000"/>
+        </w:rPr>
+        <w:t xml:space="preserve">Was in diesem Dokument noch offen ist</w:t>
+      </w:r>
+    </w:p>
+    <w:p>
+      <w:pPr>
+        <w:spacing w:after="160" w:line="276"/>
+      </w:pPr>
+      <w:r>
+        <w:rPr>
+          <w:b w:val="false"/>
+          <w:bCs w:val="false"/>
+          <w:i w:val="false"/>
+          <w:iCs w:val="false"/>
+          <w:color w:val="C00000"/>
+          <w:sz w:val="22"/>
+          <w:szCs w:val="22"/>
+        </w:rPr>
+        <w:t xml:space="preserve">Alle rot gesetzten Stellen auf einen Blick, damit man sie nicht suchen muss. Die Nummer ist der Abschnitt, in dem sie steht.</w:t>
+      </w:r>
+    </w:p>
+    <w:tbl>
+      <w:tblPr>
+        <w:tblW w:type="dxa" w:w="9000"/>
+        <w:tblBorders>
+          <w:top w:val="single" w:color="auto" w:sz="4"/>
+          <w:left w:val="single" w:color="auto" w:sz="4"/>
+          <w:bottom w:val="single" w:color="auto" w:sz="4"/>
+          <w:right w:val="single" w:color="auto" w:sz="4"/>
+          <w:insideH w:val="single" w:color="auto" w:sz="4"/>
+          <w:insideV w:val="single" w:color="auto" w:sz="4"/>
+        </w:tblBorders>
+      </w:tblPr>
+      <w:tblGrid>
+        <w:gridCol w:w="900"/>
+        <w:gridCol w:w="6400"/>
+        <w:gridCol w:w="1700"/>
+      </w:tblGrid>
+      <w:tr>
+        <w:trPr>
+          <w:tblHeader/>
+        </w:trPr>
+        <w:tc>
+          <w:tcPr>
+            <w:tcW w:type="dxa" w:w="900"/>
+            <w:shd w:fill="F2F2F2" w:val="clear"/>
+            <w:tcMar>
+              <w:top w:type="dxa" w:w="60"/>
+              <w:left w:type="dxa" w:w="100"/>
+              <w:bottom w:type="dxa" w:w="60"/>
+              <w:right w:type="dxa" w:w="100"/>
+            </w:tcMar>
+          </w:tcPr>
+          <w:p>
+            <w:pPr>
+              <w:spacing w:after="0" w:line="260"/>
+            </w:pPr>
+            <w:r>
+              <w:rPr>
+                <w:b/>
+                <w:bCs/>
+                <w:color w:val="000000"/>
+                <w:sz w:val="20"/>
+                <w:szCs w:val="20"/>
+              </w:rPr>
+              <w:t xml:space="preserve">Wo</w:t>
+            </w:r>
+          </w:p>
+        </w:tc>
+        <w:tc>
+          <w:tcPr>
+            <w:tcW w:type="dxa" w:w="6400"/>
+            <w:shd w:fill="F2F2F2" w:val="clear"/>
+            <w:tcMar>
+              <w:top w:type="dxa" w:w="60"/>
+              <w:left w:type="dxa" w:w="100"/>
+              <w:bottom w:type="dxa" w:w="60"/>
+              <w:right w:type="dxa" w:w="100"/>
+            </w:tcMar>
+          </w:tcPr>
+          <w:p>
+            <w:pPr>
+              <w:spacing w:after="0" w:line="260"/>
+            </w:pPr>
+            <w:r>
+              <w:rPr>
+                <w:b/>
+                <w:bCs/>
+                <w:color w:val="000000"/>
+                <w:sz w:val="20"/>
+                <w:szCs w:val="20"/>
+              </w:rPr>
+              <w:t xml:space="preserve">Was offen ist</w:t>
+            </w:r>
+          </w:p>
+        </w:tc>
+        <w:tc>
+          <w:tcPr>
+            <w:tcW w:type="dxa" w:w="1700"/>
+            <w:shd w:fill="F2F2F2" w:val="clear"/>
+            <w:tcMar>
+              <w:top w:type="dxa" w:w="60"/>
+              <w:left w:type="dxa" w:w="100"/>
+              <w:bottom w:type="dxa" w:w="60"/>
+              <w:right w:type="dxa" w:w="100"/>
+            </w:tcMar>
+          </w:tcPr>
+          <w:p>
+            <w:pPr>
+              <w:spacing w:after="0" w:line="260"/>
+            </w:pPr>
+            <w:r>
+              <w:rPr>
+                <w:b/>
+                <w:bCs/>
+                <w:color w:val="000000"/>
+                <w:sz w:val="20"/>
+                <w:szCs w:val="20"/>
+              </w:rPr>
+              <w:t xml:space="preserve">Wer</w:t>
+            </w:r>
+          </w:p>
+        </w:tc>
+      </w:tr>
+      <w:tr>
+        <w:tc>
+          <w:tcPr>
+            <w:tcW w:type="dxa" w:w="900"/>
+            <w:tcMar>
+              <w:top w:type="dxa" w:w="60"/>
+              <w:left w:type="dxa" w:w="100"/>
+              <w:bottom w:type="dxa" w:w="60"/>
+              <w:right w:type="dxa" w:w="100"/>
+            </w:tcMar>
+          </w:tcPr>
+          <w:p>
+            <w:pPr>
+              <w:spacing w:after="0" w:line="260"/>
+            </w:pPr>
+            <w:r>
+              <w:rPr>
+                <w:b w:val="false"/>
+                <w:bCs w:val="false"/>
+                <w:color w:val="C00000"/>
+                <w:sz w:val="20"/>
+                <w:szCs w:val="20"/>
+              </w:rPr>
+              <w:t xml:space="preserve">1</w:t>
+            </w:r>
+          </w:p>
+        </w:tc>
+        <w:tc>
+          <w:tcPr>
+            <w:tcW w:type="dxa" w:w="6400"/>
+            <w:tcMar>
+              <w:top w:type="dxa" w:w="60"/>
+              <w:left w:type="dxa" w:w="100"/>
+              <w:bottom w:type="dxa" w:w="60"/>
+              <w:right w:type="dxa" w:w="100"/>
+            </w:tcMar>
+          </w:tcPr>
+          <w:p>
+            <w:pPr>
+              <w:spacing w:after="0" w:line="260"/>
+            </w:pPr>
+            <w:r>
+              <w:rPr>
+                <w:b w:val="false"/>
+                <w:bCs w:val="false"/>
+                <w:color w:val="C00000"/>
+                <w:sz w:val="20"/>
+                <w:szCs w:val="20"/>
+              </w:rPr>
+              <w:t xml:space="preserve">Betreuung 69 € oder 59 € im Monat</w:t>
+            </w:r>
+          </w:p>
+        </w:tc>
+        <w:tc>
+          <w:tcPr>
+            <w:tcW w:type="dxa" w:w="1700"/>
+            <w:tcMar>
+              <w:top w:type="dxa" w:w="60"/>
+              <w:left w:type="dxa" w:w="100"/>
+              <w:bottom w:type="dxa" w:w="60"/>
+              <w:right w:type="dxa" w:w="100"/>
+            </w:tcMar>
+          </w:tcPr>
+          <w:p>
+            <w:pPr>
+              <w:spacing w:after="0" w:line="260"/>
+            </w:pPr>
+            <w:r>
+              <w:rPr>
+                <w:b w:val="false"/>
+                <w:bCs w:val="false"/>
+                <w:color w:val="C00000"/>
+                <w:sz w:val="20"/>
+                <w:szCs w:val="20"/>
+              </w:rPr>
+              <w:t xml:space="preserve">K+Y</w:t>
+            </w:r>
+          </w:p>
+        </w:tc>
+      </w:tr>
+      <w:tr>
+        <w:tc>
+          <w:tcPr>
+            <w:tcW w:type="dxa" w:w="900"/>
+            <w:tcMar>
+              <w:top w:type="dxa" w:w="60"/>
+              <w:left w:type="dxa" w:w="100"/>
+              <w:bottom w:type="dxa" w:w="60"/>
+              <w:right w:type="dxa" w:w="100"/>
+            </w:tcMar>
+          </w:tcPr>
+          <w:p>
+            <w:pPr>
+              <w:spacing w:after="0" w:line="260"/>
+            </w:pPr>
+            <w:r>
+              <w:rPr>
+                <w:b w:val="false"/>
+                <w:bCs w:val="false"/>
+                <w:color w:val="C00000"/>
+                <w:sz w:val="20"/>
+                <w:szCs w:val="20"/>
+              </w:rPr>
+              <w:t xml:space="preserve">2.2</w:t>
+            </w:r>
+          </w:p>
+        </w:tc>
+        <w:tc>
+          <w:tcPr>
+            <w:tcW w:type="dxa" w:w="6400"/>
+            <w:tcMar>
+              <w:top w:type="dxa" w:w="60"/>
+              <w:left w:type="dxa" w:w="100"/>
+              <w:bottom w:type="dxa" w:w="60"/>
+              <w:right w:type="dxa" w:w="100"/>
+            </w:tcMar>
+          </w:tcPr>
+          <w:p>
+            <w:pPr>
+              <w:spacing w:after="0" w:line="260"/>
+            </w:pPr>
+            <w:r>
+              <w:rPr>
+                <w:b w:val="false"/>
+                <w:bCs w:val="false"/>
+                <w:color w:val="C00000"/>
+                <w:sz w:val="20"/>
+                <w:szCs w:val="20"/>
+              </w:rPr>
+              <w:t xml:space="preserve">Kein Wettbewerberpreis hat eine Quelle mit Abrufdatum. Vor allem: Arbeiten die direkten Preisnachbarn im Fahrgebiet?</w:t>
+            </w:r>
+          </w:p>
+        </w:tc>
+        <w:tc>
+          <w:tcPr>
+            <w:tcW w:type="dxa" w:w="1700"/>
+            <w:tcMar>
+              <w:top w:type="dxa" w:w="60"/>
+              <w:left w:type="dxa" w:w="100"/>
+              <w:bottom w:type="dxa" w:w="60"/>
+              <w:right w:type="dxa" w:w="100"/>
+            </w:tcMar>
+          </w:tcPr>
+          <w:p>
+            <w:pPr>
+              <w:spacing w:after="0" w:line="260"/>
+            </w:pPr>
+            <w:r>
+              <w:rPr>
+                <w:b w:val="false"/>
+                <w:bCs w:val="false"/>
+                <w:color w:val="C00000"/>
+                <w:sz w:val="20"/>
+                <w:szCs w:val="20"/>
+              </w:rPr>
+              <w:t xml:space="preserve">Y</w:t>
+            </w:r>
+          </w:p>
+        </w:tc>
+      </w:tr>
+      <w:tr>
+        <w:tc>
+          <w:tcPr>
+            <w:tcW w:type="dxa" w:w="900"/>
+            <w:tcMar>
+              <w:top w:type="dxa" w:w="60"/>
+              <w:left w:type="dxa" w:w="100"/>
+              <w:bottom w:type="dxa" w:w="60"/>
+              <w:right w:type="dxa" w:w="100"/>
+            </w:tcMar>
+          </w:tcPr>
+          <w:p>
+            <w:pPr>
+              <w:spacing w:after="0" w:line="260"/>
+            </w:pPr>
+            <w:r>
+              <w:rPr>
+                <w:b w:val="false"/>
+                <w:bCs w:val="false"/>
+                <w:color w:val="C00000"/>
+                <w:sz w:val="20"/>
+                <w:szCs w:val="20"/>
+              </w:rPr>
+              <w:t xml:space="preserve">3.1</w:t>
+            </w:r>
+          </w:p>
+        </w:tc>
+        <w:tc>
+          <w:tcPr>
+            <w:tcW w:type="dxa" w:w="6400"/>
+            <w:tcMar>
+              <w:top w:type="dxa" w:w="60"/>
+              <w:left w:type="dxa" w:w="100"/>
+              <w:bottom w:type="dxa" w:w="60"/>
+              <w:right w:type="dxa" w:w="100"/>
+            </w:tcMar>
+          </w:tcPr>
+          <w:p>
+            <w:pPr>
+              <w:spacing w:after="0" w:line="260"/>
+            </w:pPr>
+            <w:r>
+              <w:rPr>
+                <w:b w:val="false"/>
+                <w:bCs w:val="false"/>
+                <w:color w:val="C00000"/>
+                <w:sz w:val="20"/>
+                <w:szCs w:val="20"/>
+              </w:rPr>
+              <w:t xml:space="preserve">Der Satz zur Auslastung hat keine Quelle. Belastbare Branchenzahl suchen</w:t>
+            </w:r>
+          </w:p>
+        </w:tc>
+        <w:tc>
+          <w:tcPr>
+            <w:tcW w:type="dxa" w:w="1700"/>
+            <w:tcMar>
+              <w:top w:type="dxa" w:w="60"/>
+              <w:left w:type="dxa" w:w="100"/>
+              <w:bottom w:type="dxa" w:w="60"/>
+              <w:right w:type="dxa" w:w="100"/>
+            </w:tcMar>
+          </w:tcPr>
+          <w:p>
+            <w:pPr>
+              <w:spacing w:after="0" w:line="260"/>
+            </w:pPr>
+            <w:r>
+              <w:rPr>
+                <w:b w:val="false"/>
+                <w:bCs w:val="false"/>
+                <w:color w:val="C00000"/>
+                <w:sz w:val="20"/>
+                <w:szCs w:val="20"/>
+              </w:rPr>
+              <w:t xml:space="preserve">K+Y</w:t>
+            </w:r>
+          </w:p>
+        </w:tc>
+      </w:tr>
+      <w:tr>
+        <w:tc>
+          <w:tcPr>
+            <w:tcW w:type="dxa" w:w="900"/>
+            <w:tcMar>
+              <w:top w:type="dxa" w:w="60"/>
+              <w:left w:type="dxa" w:w="100"/>
+              <w:bottom w:type="dxa" w:w="60"/>
+              <w:right w:type="dxa" w:w="100"/>
+            </w:tcMar>
+          </w:tcPr>
+          <w:p>
+            <w:pPr>
+              <w:spacing w:after="0" w:line="260"/>
+            </w:pPr>
+            <w:r>
+              <w:rPr>
+                <w:b w:val="false"/>
+                <w:bCs w:val="false"/>
+                <w:color w:val="C00000"/>
+                <w:sz w:val="20"/>
+                <w:szCs w:val="20"/>
+              </w:rPr>
+              <w:t xml:space="preserve">4.1</w:t>
+            </w:r>
+          </w:p>
+        </w:tc>
+        <w:tc>
+          <w:tcPr>
+            <w:tcW w:type="dxa" w:w="6400"/>
+            <w:tcMar>
+              <w:top w:type="dxa" w:w="60"/>
+              <w:left w:type="dxa" w:w="100"/>
+              <w:bottom w:type="dxa" w:w="60"/>
+              <w:right w:type="dxa" w:w="100"/>
+            </w:tcMar>
+          </w:tcPr>
+          <w:p>
+            <w:pPr>
+              <w:spacing w:after="0" w:line="260"/>
+            </w:pPr>
+            <w:r>
+              <w:rPr>
+                <w:b w:val="false"/>
+                <w:bCs w:val="false"/>
+                <w:color w:val="C00000"/>
+                <w:sz w:val="20"/>
+                <w:szCs w:val="20"/>
+              </w:rPr>
+              <w:t xml:space="preserve">Paket S: beworben wird 990 €, verkauft werden soll 1.490 €. Streichen oder zuschneiden?</w:t>
+            </w:r>
+          </w:p>
+        </w:tc>
+        <w:tc>
+          <w:tcPr>
+            <w:tcW w:type="dxa" w:w="1700"/>
+            <w:tcMar>
+              <w:top w:type="dxa" w:w="60"/>
+              <w:left w:type="dxa" w:w="100"/>
+              <w:bottom w:type="dxa" w:w="60"/>
+              <w:right w:type="dxa" w:w="100"/>
+            </w:tcMar>
+          </w:tcPr>
+          <w:p>
+            <w:pPr>
+              <w:spacing w:after="0" w:line="260"/>
+            </w:pPr>
+            <w:r>
+              <w:rPr>
+                <w:b w:val="false"/>
+                <w:bCs w:val="false"/>
+                <w:color w:val="C00000"/>
+                <w:sz w:val="20"/>
+                <w:szCs w:val="20"/>
+              </w:rPr>
+              <w:t xml:space="preserve">K+Y</w:t>
+            </w:r>
+          </w:p>
+        </w:tc>
+      </w:tr>
+      <w:tr>
+        <w:tc>
+          <w:tcPr>
+            <w:tcW w:type="dxa" w:w="900"/>
+            <w:tcMar>
+              <w:top w:type="dxa" w:w="60"/>
+              <w:left w:type="dxa" w:w="100"/>
+              <w:bottom w:type="dxa" w:w="60"/>
+              <w:right w:type="dxa" w:w="100"/>
+            </w:tcMar>
+          </w:tcPr>
+          <w:p>
+            <w:pPr>
+              <w:spacing w:after="0" w:line="260"/>
+            </w:pPr>
+            <w:r>
+              <w:rPr>
+                <w:b w:val="false"/>
+                <w:bCs w:val="false"/>
+                <w:color w:val="C00000"/>
+                <w:sz w:val="20"/>
+                <w:szCs w:val="20"/>
+              </w:rPr>
+              <w:t xml:space="preserve">4.2</w:t>
+            </w:r>
+          </w:p>
+        </w:tc>
+        <w:tc>
+          <w:tcPr>
+            <w:tcW w:type="dxa" w:w="6400"/>
+            <w:tcMar>
+              <w:top w:type="dxa" w:w="60"/>
+              <w:left w:type="dxa" w:w="100"/>
+              <w:bottom w:type="dxa" w:w="60"/>
+              <w:right w:type="dxa" w:w="100"/>
+            </w:tcMar>
+          </w:tcPr>
+          <w:p>
+            <w:pPr>
+              <w:spacing w:after="0" w:line="260"/>
+            </w:pPr>
+            <w:r>
+              <w:rPr>
+                <w:b w:val="false"/>
+                <w:bCs w:val="false"/>
+                <w:color w:val="C00000"/>
+                <w:sz w:val="20"/>
+                <w:szCs w:val="20"/>
+              </w:rPr>
+              <w:t xml:space="preserve">Die 15 % Minderung und der Einbehalt der Anzahlung sind Vorschläge, keine geprüften Klauseln</w:t>
+            </w:r>
+          </w:p>
+        </w:tc>
+        <w:tc>
+          <w:tcPr>
+            <w:tcW w:type="dxa" w:w="1700"/>
+            <w:tcMar>
+              <w:top w:type="dxa" w:w="60"/>
+              <w:left w:type="dxa" w:w="100"/>
+              <w:bottom w:type="dxa" w:w="60"/>
+              <w:right w:type="dxa" w:w="100"/>
+            </w:tcMar>
+          </w:tcPr>
+          <w:p>
+            <w:pPr>
+              <w:spacing w:after="0" w:line="260"/>
+            </w:pPr>
+            <w:r>
+              <w:rPr>
+                <w:b w:val="false"/>
+                <w:bCs w:val="false"/>
+                <w:color w:val="C00000"/>
+                <w:sz w:val="20"/>
+                <w:szCs w:val="20"/>
+              </w:rPr>
+              <w:t xml:space="preserve">Y</w:t>
+            </w:r>
+          </w:p>
+        </w:tc>
+      </w:tr>
+      <w:tr>
+        <w:tc>
+          <w:tcPr>
+            <w:tcW w:type="dxa" w:w="900"/>
+            <w:tcMar>
+              <w:top w:type="dxa" w:w="60"/>
+              <w:left w:type="dxa" w:w="100"/>
+              <w:bottom w:type="dxa" w:w="60"/>
+              <w:right w:type="dxa" w:w="100"/>
+            </w:tcMar>
+          </w:tcPr>
+          <w:p>
+            <w:pPr>
+              <w:spacing w:after="0" w:line="260"/>
+            </w:pPr>
+            <w:r>
+              <w:rPr>
+                <w:b w:val="false"/>
+                <w:bCs w:val="false"/>
+                <w:color w:val="C00000"/>
+                <w:sz w:val="20"/>
+                <w:szCs w:val="20"/>
+              </w:rPr>
+              <w:t xml:space="preserve">4.3</w:t>
+            </w:r>
+          </w:p>
+        </w:tc>
+        <w:tc>
+          <w:tcPr>
+            <w:tcW w:type="dxa" w:w="6400"/>
+            <w:tcMar>
+              <w:top w:type="dxa" w:w="60"/>
+              <w:left w:type="dxa" w:w="100"/>
+              <w:bottom w:type="dxa" w:w="60"/>
+              <w:right w:type="dxa" w:w="100"/>
+            </w:tcMar>
+          </w:tcPr>
+          <w:p>
+            <w:pPr>
+              <w:spacing w:after="0" w:line="260"/>
+            </w:pPr>
+            <w:r>
+              <w:rPr>
+                <w:b w:val="false"/>
+                <w:bCs w:val="false"/>
+                <w:color w:val="C00000"/>
+                <w:sz w:val="20"/>
+                <w:szCs w:val="20"/>
+              </w:rPr>
+              <w:t xml:space="preserve">Preis für einen halben Tag Fotoaufnahmen festlegen, Fotograf fragen</w:t>
+            </w:r>
+          </w:p>
+        </w:tc>
+        <w:tc>
+          <w:tcPr>
+            <w:tcW w:type="dxa" w:w="1700"/>
+            <w:tcMar>
+              <w:top w:type="dxa" w:w="60"/>
+              <w:left w:type="dxa" w:w="100"/>
+              <w:bottom w:type="dxa" w:w="60"/>
+              <w:right w:type="dxa" w:w="100"/>
+            </w:tcMar>
+          </w:tcPr>
+          <w:p>
+            <w:pPr>
+              <w:spacing w:after="0" w:line="260"/>
+            </w:pPr>
+            <w:r>
+              <w:rPr>
+                <w:b w:val="false"/>
+                <w:bCs w:val="false"/>
+                <w:color w:val="C00000"/>
+                <w:sz w:val="20"/>
+                <w:szCs w:val="20"/>
+              </w:rPr>
+              <w:t xml:space="preserve">K</w:t>
+            </w:r>
+          </w:p>
+        </w:tc>
+      </w:tr>
+      <w:tr>
+        <w:tc>
+          <w:tcPr>
+            <w:tcW w:type="dxa" w:w="900"/>
+            <w:tcMar>
+              <w:top w:type="dxa" w:w="60"/>
+              <w:left w:type="dxa" w:w="100"/>
+              <w:bottom w:type="dxa" w:w="60"/>
+              <w:right w:type="dxa" w:w="100"/>
+            </w:tcMar>
+          </w:tcPr>
+          <w:p>
+            <w:pPr>
+              <w:spacing w:after="0" w:line="260"/>
+            </w:pPr>
+            <w:r>
+              <w:rPr>
+                <w:b w:val="false"/>
+                <w:bCs w:val="false"/>
+                <w:color w:val="C00000"/>
+                <w:sz w:val="20"/>
+                <w:szCs w:val="20"/>
+              </w:rPr>
+              <w:t xml:space="preserve">4.4</w:t>
+            </w:r>
+          </w:p>
+        </w:tc>
+        <w:tc>
+          <w:tcPr>
+            <w:tcW w:type="dxa" w:w="6400"/>
+            <w:tcMar>
+              <w:top w:type="dxa" w:w="60"/>
+              <w:left w:type="dxa" w:w="100"/>
+              <w:bottom w:type="dxa" w:w="60"/>
+              <w:right w:type="dxa" w:w="100"/>
+            </w:tcMar>
+          </w:tcPr>
+          <w:p>
+            <w:pPr>
+              <w:spacing w:after="0" w:line="260"/>
+            </w:pPr>
+            <w:r>
+              <w:rPr>
+                <w:b w:val="false"/>
+                <w:bCs w:val="false"/>
+                <w:color w:val="C00000"/>
+                <w:sz w:val="20"/>
+                <w:szCs w:val="20"/>
+              </w:rPr>
+              <w:t xml:space="preserve">Einwandbehandlung ist ein Entwurf und wird noch ausgearbeitet</w:t>
+            </w:r>
+          </w:p>
+        </w:tc>
+        <w:tc>
+          <w:tcPr>
+            <w:tcW w:type="dxa" w:w="1700"/>
+            <w:tcMar>
+              <w:top w:type="dxa" w:w="60"/>
+              <w:left w:type="dxa" w:w="100"/>
+              <w:bottom w:type="dxa" w:w="60"/>
+              <w:right w:type="dxa" w:w="100"/>
+            </w:tcMar>
+          </w:tcPr>
+          <w:p>
+            <w:pPr>
+              <w:spacing w:after="0" w:line="260"/>
+            </w:pPr>
+            <w:r>
+              <w:rPr>
+                <w:b w:val="false"/>
+                <w:bCs w:val="false"/>
+                <w:color w:val="C00000"/>
+                <w:sz w:val="20"/>
+                <w:szCs w:val="20"/>
+              </w:rPr>
+              <w:t xml:space="preserve">K+Y</w:t>
+            </w:r>
+          </w:p>
+        </w:tc>
+      </w:tr>
+      <w:tr>
+        <w:tc>
+          <w:tcPr>
+            <w:tcW w:type="dxa" w:w="900"/>
+            <w:tcMar>
+              <w:top w:type="dxa" w:w="60"/>
+              <w:left w:type="dxa" w:w="100"/>
+              <w:bottom w:type="dxa" w:w="60"/>
+              <w:right w:type="dxa" w:w="100"/>
+            </w:tcMar>
+          </w:tcPr>
+          <w:p>
+            <w:pPr>
+              <w:spacing w:after="0" w:line="260"/>
+            </w:pPr>
+            <w:r>
+              <w:rPr>
+                <w:b w:val="false"/>
+                <w:bCs w:val="false"/>
+                <w:color w:val="C00000"/>
+                <w:sz w:val="20"/>
+                <w:szCs w:val="20"/>
+              </w:rPr>
+              <w:t xml:space="preserve">5</w:t>
+            </w:r>
+          </w:p>
+        </w:tc>
+        <w:tc>
+          <w:tcPr>
+            <w:tcW w:type="dxa" w:w="6400"/>
+            <w:tcMar>
+              <w:top w:type="dxa" w:w="60"/>
+              <w:left w:type="dxa" w:w="100"/>
+              <w:bottom w:type="dxa" w:w="60"/>
+              <w:right w:type="dxa" w:w="100"/>
+            </w:tcMar>
+          </w:tcPr>
+          <w:p>
+            <w:pPr>
+              <w:spacing w:after="0" w:line="260"/>
+            </w:pPr>
+            <w:r>
+              <w:rPr>
+                <w:b w:val="false"/>
+                <w:bCs w:val="false"/>
+                <w:color w:val="C00000"/>
+                <w:sz w:val="20"/>
+                <w:szCs w:val="20"/>
+              </w:rPr>
+              <w:t xml:space="preserve">Check-Vorlage trägt Yanniks Namen mit Kiras Mailadresse — korrigieren</w:t>
+            </w:r>
+          </w:p>
+        </w:tc>
+        <w:tc>
+          <w:tcPr>
+            <w:tcW w:type="dxa" w:w="1700"/>
+            <w:tcMar>
+              <w:top w:type="dxa" w:w="60"/>
+              <w:left w:type="dxa" w:w="100"/>
+              <w:bottom w:type="dxa" w:w="60"/>
+              <w:right w:type="dxa" w:w="100"/>
+            </w:tcMar>
+          </w:tcPr>
+          <w:p>
+            <w:pPr>
+              <w:spacing w:after="0" w:line="260"/>
+            </w:pPr>
+            <w:r>
+              <w:rPr>
+                <w:b w:val="false"/>
+                <w:bCs w:val="false"/>
+                <w:color w:val="C00000"/>
+                <w:sz w:val="20"/>
+                <w:szCs w:val="20"/>
+              </w:rPr>
+              <w:t xml:space="preserve">C</w:t>
+            </w:r>
+          </w:p>
+        </w:tc>
+      </w:tr>
+      <w:tr>
+        <w:tc>
+          <w:tcPr>
+            <w:tcW w:type="dxa" w:w="900"/>
+            <w:tcMar>
+              <w:top w:type="dxa" w:w="60"/>
+              <w:left w:type="dxa" w:w="100"/>
+              <w:bottom w:type="dxa" w:w="60"/>
+              <w:right w:type="dxa" w:w="100"/>
+            </w:tcMar>
+          </w:tcPr>
+          <w:p>
+            <w:pPr>
+              <w:spacing w:after="0" w:line="260"/>
+            </w:pPr>
+            <w:r>
+              <w:rPr>
+                <w:b w:val="false"/>
+                <w:bCs w:val="false"/>
+                <w:color w:val="C00000"/>
+                <w:sz w:val="20"/>
+                <w:szCs w:val="20"/>
+              </w:rPr>
+              <w:t xml:space="preserve">7.1</w:t>
+            </w:r>
+          </w:p>
+        </w:tc>
+        <w:tc>
+          <w:tcPr>
+            <w:tcW w:type="dxa" w:w="6400"/>
+            <w:tcMar>
+              <w:top w:type="dxa" w:w="60"/>
+              <w:left w:type="dxa" w:w="100"/>
+              <w:bottom w:type="dxa" w:w="60"/>
+              <w:right w:type="dxa" w:w="100"/>
+            </w:tcMar>
+          </w:tcPr>
+          <w:p>
+            <w:pPr>
+              <w:spacing w:after="0" w:line="260"/>
+            </w:pPr>
+            <w:r>
+              <w:rPr>
+                <w:b w:val="false"/>
+                <w:bCs w:val="false"/>
+                <w:color w:val="C00000"/>
+                <w:sz w:val="20"/>
+                <w:szCs w:val="20"/>
+              </w:rPr>
+              <w:t xml:space="preserve">Was der Kunde selbst bedienen kann: drei Wege, noch nicht entschieden</w:t>
+            </w:r>
+          </w:p>
+        </w:tc>
+        <w:tc>
+          <w:tcPr>
+            <w:tcW w:type="dxa" w:w="1700"/>
+            <w:tcMar>
+              <w:top w:type="dxa" w:w="60"/>
+              <w:left w:type="dxa" w:w="100"/>
+              <w:bottom w:type="dxa" w:w="60"/>
+              <w:right w:type="dxa" w:w="100"/>
+            </w:tcMar>
+          </w:tcPr>
+          <w:p>
+            <w:pPr>
+              <w:spacing w:after="0" w:line="260"/>
+            </w:pPr>
+            <w:r>
+              <w:rPr>
+                <w:b w:val="false"/>
+                <w:bCs w:val="false"/>
+                <w:color w:val="C00000"/>
+                <w:sz w:val="20"/>
+                <w:szCs w:val="20"/>
+              </w:rPr>
+              <w:t xml:space="preserve">K</w:t>
+            </w:r>
+          </w:p>
+        </w:tc>
+      </w:tr>
+      <w:tr>
+        <w:tc>
+          <w:tcPr>
+            <w:tcW w:type="dxa" w:w="900"/>
+            <w:tcMar>
+              <w:top w:type="dxa" w:w="60"/>
+              <w:left w:type="dxa" w:w="100"/>
+              <w:bottom w:type="dxa" w:w="60"/>
+              <w:right w:type="dxa" w:w="100"/>
+            </w:tcMar>
+          </w:tcPr>
+          <w:p>
+            <w:pPr>
+              <w:spacing w:after="0" w:line="260"/>
+            </w:pPr>
+            <w:r>
+              <w:rPr>
+                <w:b w:val="false"/>
+                <w:bCs w:val="false"/>
+                <w:color w:val="C00000"/>
+                <w:sz w:val="20"/>
+                <w:szCs w:val="20"/>
+              </w:rPr>
+              <w:t xml:space="preserve">7.1</w:t>
+            </w:r>
+          </w:p>
+        </w:tc>
+        <w:tc>
+          <w:tcPr>
+            <w:tcW w:type="dxa" w:w="6400"/>
+            <w:tcMar>
+              <w:top w:type="dxa" w:w="60"/>
+              <w:left w:type="dxa" w:w="100"/>
+              <w:bottom w:type="dxa" w:w="60"/>
+              <w:right w:type="dxa" w:w="100"/>
+            </w:tcMar>
+          </w:tcPr>
+          <w:p>
+            <w:pPr>
+              <w:spacing w:after="0" w:line="260"/>
+            </w:pPr>
+            <w:r>
+              <w:rPr>
+                <w:b w:val="false"/>
+                <w:bCs w:val="false"/>
+                <w:color w:val="C00000"/>
+                <w:sz w:val="20"/>
+                <w:szCs w:val="20"/>
+              </w:rPr>
+              <w:t xml:space="preserve">Kontaktformular — ohne Entscheidung ist kein Projekt auslieferbar</w:t>
+            </w:r>
+          </w:p>
+        </w:tc>
+        <w:tc>
+          <w:tcPr>
+            <w:tcW w:type="dxa" w:w="1700"/>
+            <w:tcMar>
+              <w:top w:type="dxa" w:w="60"/>
+              <w:left w:type="dxa" w:w="100"/>
+              <w:bottom w:type="dxa" w:w="60"/>
+              <w:right w:type="dxa" w:w="100"/>
+            </w:tcMar>
+          </w:tcPr>
+          <w:p>
+            <w:pPr>
+              <w:spacing w:after="0" w:line="260"/>
+            </w:pPr>
+            <w:r>
+              <w:rPr>
+                <w:b w:val="false"/>
+                <w:bCs w:val="false"/>
+                <w:color w:val="C00000"/>
+                <w:sz w:val="20"/>
+                <w:szCs w:val="20"/>
+              </w:rPr>
+              <w:t xml:space="preserve">K</w:t>
+            </w:r>
+          </w:p>
+        </w:tc>
+      </w:tr>
+      <w:tr>
+        <w:tc>
+          <w:tcPr>
+            <w:tcW w:type="dxa" w:w="900"/>
+            <w:tcMar>
+              <w:top w:type="dxa" w:w="60"/>
+              <w:left w:type="dxa" w:w="100"/>
+              <w:bottom w:type="dxa" w:w="60"/>
+              <w:right w:type="dxa" w:w="100"/>
+            </w:tcMar>
+          </w:tcPr>
+          <w:p>
+            <w:pPr>
+              <w:spacing w:after="0" w:line="260"/>
+            </w:pPr>
+            <w:r>
+              <w:rPr>
+                <w:b w:val="false"/>
+                <w:bCs w:val="false"/>
+                <w:color w:val="C00000"/>
+                <w:sz w:val="20"/>
+                <w:szCs w:val="20"/>
+              </w:rPr>
+              <w:t xml:space="preserve">10.1</w:t>
+            </w:r>
+          </w:p>
+        </w:tc>
+        <w:tc>
+          <w:tcPr>
+            <w:tcW w:type="dxa" w:w="6400"/>
+            <w:tcMar>
+              <w:top w:type="dxa" w:w="60"/>
+              <w:left w:type="dxa" w:w="100"/>
+              <w:bottom w:type="dxa" w:w="60"/>
+              <w:right w:type="dxa" w:w="100"/>
+            </w:tcMar>
+          </w:tcPr>
+          <w:p>
+            <w:pPr>
+              <w:spacing w:after="0" w:line="260"/>
+            </w:pPr>
+            <w:r>
+              <w:rPr>
+                <w:b w:val="false"/>
+                <w:bCs w:val="false"/>
+                <w:color w:val="C00000"/>
+                <w:sz w:val="20"/>
+                <w:szCs w:val="20"/>
+              </w:rPr>
+              <w:t xml:space="preserve">Claude-Abo: kommerzieller Tarif mit AV-Vertrag nötig, Preis prüfen</w:t>
+            </w:r>
+          </w:p>
+        </w:tc>
+        <w:tc>
+          <w:tcPr>
+            <w:tcW w:type="dxa" w:w="1700"/>
+            <w:tcMar>
+              <w:top w:type="dxa" w:w="60"/>
+              <w:left w:type="dxa" w:w="100"/>
+              <w:bottom w:type="dxa" w:w="60"/>
+              <w:right w:type="dxa" w:w="100"/>
+            </w:tcMar>
+          </w:tcPr>
+          <w:p>
+            <w:pPr>
+              <w:spacing w:after="0" w:line="260"/>
+            </w:pPr>
+            <w:r>
+              <w:rPr>
+                <w:b w:val="false"/>
+                <w:bCs w:val="false"/>
+                <w:color w:val="C00000"/>
+                <w:sz w:val="20"/>
+                <w:szCs w:val="20"/>
+              </w:rPr>
+              <w:t xml:space="preserve">K</w:t>
+            </w:r>
+          </w:p>
+        </w:tc>
+      </w:tr>
+      <w:tr>
+        <w:tc>
+          <w:tcPr>
+            <w:tcW w:type="dxa" w:w="900"/>
+            <w:tcMar>
+              <w:top w:type="dxa" w:w="60"/>
+              <w:left w:type="dxa" w:w="100"/>
+              <w:bottom w:type="dxa" w:w="60"/>
+              <w:right w:type="dxa" w:w="100"/>
+            </w:tcMar>
+          </w:tcPr>
+          <w:p>
+            <w:pPr>
+              <w:spacing w:after="0" w:line="260"/>
+            </w:pPr>
+            <w:r>
+              <w:rPr>
+                <w:b w:val="false"/>
+                <w:bCs w:val="false"/>
+                <w:color w:val="C00000"/>
+                <w:sz w:val="20"/>
+                <w:szCs w:val="20"/>
+              </w:rPr>
+              <w:t xml:space="preserve">10.2</w:t>
+            </w:r>
+          </w:p>
+        </w:tc>
+        <w:tc>
+          <w:tcPr>
+            <w:tcW w:type="dxa" w:w="6400"/>
+            <w:tcMar>
+              <w:top w:type="dxa" w:w="60"/>
+              <w:left w:type="dxa" w:w="100"/>
+              <w:bottom w:type="dxa" w:w="60"/>
+              <w:right w:type="dxa" w:w="100"/>
+            </w:tcMar>
+          </w:tcPr>
+          <w:p>
+            <w:pPr>
+              <w:spacing w:after="0" w:line="260"/>
+            </w:pPr>
+            <w:r>
+              <w:rPr>
+                <w:b w:val="false"/>
+                <w:bCs w:val="false"/>
+                <w:color w:val="C00000"/>
+                <w:sz w:val="20"/>
+                <w:szCs w:val="20"/>
+              </w:rPr>
+              <w:t xml:space="preserve">Wovon wir im ersten Jahr leben — schriftlich, mit Betrag und Dauer</w:t>
+            </w:r>
+          </w:p>
+        </w:tc>
+        <w:tc>
+          <w:tcPr>
+            <w:tcW w:type="dxa" w:w="1700"/>
+            <w:tcMar>
+              <w:top w:type="dxa" w:w="60"/>
+              <w:left w:type="dxa" w:w="100"/>
+              <w:bottom w:type="dxa" w:w="60"/>
+              <w:right w:type="dxa" w:w="100"/>
+            </w:tcMar>
+          </w:tcPr>
+          <w:p>
+            <w:pPr>
+              <w:spacing w:after="0" w:line="260"/>
+            </w:pPr>
+            <w:r>
+              <w:rPr>
+                <w:b w:val="false"/>
+                <w:bCs w:val="false"/>
+                <w:color w:val="C00000"/>
+                <w:sz w:val="20"/>
+                <w:szCs w:val="20"/>
+              </w:rPr>
+              <w:t xml:space="preserve">K+Y</w:t>
+            </w:r>
+          </w:p>
+        </w:tc>
+      </w:tr>
+      <w:tr>
+        <w:tc>
+          <w:tcPr>
+            <w:tcW w:type="dxa" w:w="900"/>
+            <w:tcMar>
+              <w:top w:type="dxa" w:w="60"/>
+              <w:left w:type="dxa" w:w="100"/>
+              <w:bottom w:type="dxa" w:w="60"/>
+              <w:right w:type="dxa" w:w="100"/>
+            </w:tcMar>
+          </w:tcPr>
+          <w:p>
+            <w:pPr>
+              <w:spacing w:after="0" w:line="260"/>
+            </w:pPr>
+            <w:r>
+              <w:rPr>
+                <w:b w:val="false"/>
+                <w:bCs w:val="false"/>
+                <w:color w:val="C00000"/>
+                <w:sz w:val="20"/>
+                <w:szCs w:val="20"/>
+              </w:rPr>
+              <w:t xml:space="preserve">10.3</w:t>
+            </w:r>
+          </w:p>
+        </w:tc>
+        <w:tc>
+          <w:tcPr>
+            <w:tcW w:type="dxa" w:w="6400"/>
+            <w:tcMar>
+              <w:top w:type="dxa" w:w="60"/>
+              <w:left w:type="dxa" w:w="100"/>
+              <w:bottom w:type="dxa" w:w="60"/>
+              <w:right w:type="dxa" w:w="100"/>
+            </w:tcMar>
+          </w:tcPr>
+          <w:p>
+            <w:pPr>
+              <w:spacing w:after="0" w:line="260"/>
+            </w:pPr>
+            <w:r>
+              <w:rPr>
+                <w:b w:val="false"/>
+                <w:bCs w:val="false"/>
+                <w:color w:val="C00000"/>
+                <w:sz w:val="20"/>
+                <w:szCs w:val="20"/>
+              </w:rPr>
+              <w:t xml:space="preserve">Konversionsannahmen sind ungeprüft und durch keine Quelle gedeckt</w:t>
+            </w:r>
+          </w:p>
+        </w:tc>
+        <w:tc>
+          <w:tcPr>
+            <w:tcW w:type="dxa" w:w="1700"/>
+            <w:tcMar>
+              <w:top w:type="dxa" w:w="60"/>
+              <w:left w:type="dxa" w:w="100"/>
+              <w:bottom w:type="dxa" w:w="60"/>
+              <w:right w:type="dxa" w:w="100"/>
+            </w:tcMar>
+          </w:tcPr>
+          <w:p>
+            <w:pPr>
+              <w:spacing w:after="0" w:line="260"/>
+            </w:pPr>
+            <w:r>
+              <w:rPr>
+                <w:b w:val="false"/>
+                <w:bCs w:val="false"/>
+                <w:color w:val="C00000"/>
+                <w:sz w:val="20"/>
+                <w:szCs w:val="20"/>
+              </w:rPr>
+              <w:t xml:space="preserve">K+Y</w:t>
+            </w:r>
+          </w:p>
+        </w:tc>
+      </w:tr>
+      <w:tr>
+        <w:tc>
+          <w:tcPr>
+            <w:tcW w:type="dxa" w:w="900"/>
+            <w:tcMar>
+              <w:top w:type="dxa" w:w="60"/>
+              <w:left w:type="dxa" w:w="100"/>
+              <w:bottom w:type="dxa" w:w="60"/>
+              <w:right w:type="dxa" w:w="100"/>
+            </w:tcMar>
+          </w:tcPr>
+          <w:p>
+            <w:pPr>
+              <w:spacing w:after="0" w:line="260"/>
+            </w:pPr>
+            <w:r>
+              <w:rPr>
+                <w:b w:val="false"/>
+                <w:bCs w:val="false"/>
+                <w:color w:val="C00000"/>
+                <w:sz w:val="20"/>
+                <w:szCs w:val="20"/>
+              </w:rPr>
+              <w:t xml:space="preserve">10.4</w:t>
+            </w:r>
+          </w:p>
+        </w:tc>
+        <w:tc>
+          <w:tcPr>
+            <w:tcW w:type="dxa" w:w="6400"/>
+            <w:tcMar>
+              <w:top w:type="dxa" w:w="60"/>
+              <w:left w:type="dxa" w:w="100"/>
+              <w:bottom w:type="dxa" w:w="60"/>
+              <w:right w:type="dxa" w:w="100"/>
+            </w:tcMar>
+          </w:tcPr>
+          <w:p>
+            <w:pPr>
+              <w:spacing w:after="0" w:line="260"/>
+            </w:pPr>
+            <w:r>
+              <w:rPr>
+                <w:b w:val="false"/>
+                <w:bCs w:val="false"/>
+                <w:color w:val="C00000"/>
+                <w:sz w:val="20"/>
+                <w:szCs w:val="20"/>
+              </w:rPr>
+              <w:t xml:space="preserve">Betreuungsbestand trägt bei jetziger Rate erst nach fünf Jahren</w:t>
+            </w:r>
+          </w:p>
+        </w:tc>
+        <w:tc>
+          <w:tcPr>
+            <w:tcW w:type="dxa" w:w="1700"/>
+            <w:tcMar>
+              <w:top w:type="dxa" w:w="60"/>
+              <w:left w:type="dxa" w:w="100"/>
+              <w:bottom w:type="dxa" w:w="60"/>
+              <w:right w:type="dxa" w:w="100"/>
+            </w:tcMar>
+          </w:tcPr>
+          <w:p>
+            <w:pPr>
+              <w:spacing w:after="0" w:line="260"/>
+            </w:pPr>
+            <w:r>
+              <w:rPr>
+                <w:b w:val="false"/>
+                <w:bCs w:val="false"/>
+                <w:color w:val="C00000"/>
+                <w:sz w:val="20"/>
+                <w:szCs w:val="20"/>
+              </w:rPr>
+              <w:t xml:space="preserve">K+Y</w:t>
+            </w:r>
+          </w:p>
+        </w:tc>
+      </w:tr>
+      <w:tr>
+        <w:tc>
+          <w:tcPr>
+            <w:tcW w:type="dxa" w:w="900"/>
+            <w:tcMar>
+              <w:top w:type="dxa" w:w="60"/>
+              <w:left w:type="dxa" w:w="100"/>
+              <w:bottom w:type="dxa" w:w="60"/>
+              <w:right w:type="dxa" w:w="100"/>
+            </w:tcMar>
+          </w:tcPr>
+          <w:p>
+            <w:pPr>
+              <w:spacing w:after="0" w:line="260"/>
+            </w:pPr>
+            <w:r>
+              <w:rPr>
+                <w:b w:val="false"/>
+                <w:bCs w:val="false"/>
+                <w:color w:val="C00000"/>
+                <w:sz w:val="20"/>
+                <w:szCs w:val="20"/>
+              </w:rPr>
+              <w:t xml:space="preserve">12</w:t>
+            </w:r>
+          </w:p>
+        </w:tc>
+        <w:tc>
+          <w:tcPr>
+            <w:tcW w:type="dxa" w:w="6400"/>
+            <w:tcMar>
+              <w:top w:type="dxa" w:w="60"/>
+              <w:left w:type="dxa" w:w="100"/>
+              <w:bottom w:type="dxa" w:w="60"/>
+              <w:right w:type="dxa" w:w="100"/>
+            </w:tcMar>
+          </w:tcPr>
+          <w:p>
+            <w:pPr>
+              <w:spacing w:after="0" w:line="260"/>
+            </w:pPr>
+            <w:r>
+              <w:rPr>
+                <w:b w:val="false"/>
+                <w:bCs w:val="false"/>
+                <w:color w:val="C00000"/>
+                <w:sz w:val="20"/>
+                <w:szCs w:val="20"/>
+              </w:rPr>
+              <w:t xml:space="preserve">Verfügbare Wochenstunden, feste Tage und Uhrzeiten — der wichtigste offene Punkt</w:t>
+            </w:r>
+          </w:p>
+        </w:tc>
+        <w:tc>
+          <w:tcPr>
+            <w:tcW w:type="dxa" w:w="1700"/>
+            <w:tcMar>
+              <w:top w:type="dxa" w:w="60"/>
+              <w:left w:type="dxa" w:w="100"/>
+              <w:bottom w:type="dxa" w:w="60"/>
+              <w:right w:type="dxa" w:w="100"/>
+            </w:tcMar>
+          </w:tcPr>
+          <w:p>
+            <w:pPr>
+              <w:spacing w:after="0" w:line="260"/>
+            </w:pPr>
+            <w:r>
+              <w:rPr>
+                <w:b w:val="false"/>
+                <w:bCs w:val="false"/>
+                <w:color w:val="C00000"/>
+                <w:sz w:val="20"/>
+                <w:szCs w:val="20"/>
+              </w:rPr>
+              <w:t xml:space="preserve">K+Y</w:t>
+            </w:r>
+          </w:p>
+        </w:tc>
+      </w:tr>
+      <w:tr>
+        <w:tc>
+          <w:tcPr>
+            <w:tcW w:type="dxa" w:w="900"/>
+            <w:tcMar>
+              <w:top w:type="dxa" w:w="60"/>
+              <w:left w:type="dxa" w:w="100"/>
+              <w:bottom w:type="dxa" w:w="60"/>
+              <w:right w:type="dxa" w:w="100"/>
+            </w:tcMar>
+          </w:tcPr>
+          <w:p>
+            <w:pPr>
+              <w:spacing w:after="0" w:line="260"/>
+            </w:pPr>
+            <w:r>
+              <w:rPr>
+                <w:b w:val="false"/>
+                <w:bCs w:val="false"/>
+                <w:color w:val="C00000"/>
+                <w:sz w:val="20"/>
+                <w:szCs w:val="20"/>
+              </w:rPr>
+              <w:t xml:space="preserve">12</w:t>
+            </w:r>
+          </w:p>
+        </w:tc>
+        <w:tc>
+          <w:tcPr>
+            <w:tcW w:type="dxa" w:w="6400"/>
+            <w:tcMar>
+              <w:top w:type="dxa" w:w="60"/>
+              <w:left w:type="dxa" w:w="100"/>
+              <w:bottom w:type="dxa" w:w="60"/>
+              <w:right w:type="dxa" w:w="100"/>
+            </w:tcMar>
+          </w:tcPr>
+          <w:p>
+            <w:pPr>
+              <w:spacing w:after="0" w:line="260"/>
+            </w:pPr>
+            <w:r>
+              <w:rPr>
+                <w:b w:val="false"/>
+                <w:bCs w:val="false"/>
+                <w:color w:val="C00000"/>
+                <w:sz w:val="20"/>
+                <w:szCs w:val="20"/>
+              </w:rPr>
+              <w:t xml:space="preserve">Ausfall einer Person: produzieren kann nur Kira</w:t>
+            </w:r>
+          </w:p>
+        </w:tc>
+        <w:tc>
+          <w:tcPr>
+            <w:tcW w:type="dxa" w:w="1700"/>
+            <w:tcMar>
+              <w:top w:type="dxa" w:w="60"/>
+              <w:left w:type="dxa" w:w="100"/>
+              <w:bottom w:type="dxa" w:w="60"/>
+              <w:right w:type="dxa" w:w="100"/>
+            </w:tcMar>
+          </w:tcPr>
+          <w:p>
+            <w:pPr>
+              <w:spacing w:after="0" w:line="260"/>
+            </w:pPr>
+            <w:r>
+              <w:rPr>
+                <w:b w:val="false"/>
+                <w:bCs w:val="false"/>
+                <w:color w:val="C00000"/>
+                <w:sz w:val="20"/>
+                <w:szCs w:val="20"/>
+              </w:rPr>
+              <w:t xml:space="preserve">K</w:t>
+            </w:r>
+          </w:p>
+        </w:tc>
+      </w:tr>
+      <w:tr>
+        <w:tc>
+          <w:tcPr>
+            <w:tcW w:type="dxa" w:w="900"/>
+            <w:tcMar>
+              <w:top w:type="dxa" w:w="60"/>
+              <w:left w:type="dxa" w:w="100"/>
+              <w:bottom w:type="dxa" w:w="60"/>
+              <w:right w:type="dxa" w:w="100"/>
+            </w:tcMar>
+          </w:tcPr>
+          <w:p>
+            <w:pPr>
+              <w:spacing w:after="0" w:line="260"/>
+            </w:pPr>
+            <w:r>
+              <w:rPr>
+                <w:b w:val="false"/>
+                <w:bCs w:val="false"/>
+                <w:color w:val="C00000"/>
+                <w:sz w:val="20"/>
+                <w:szCs w:val="20"/>
+              </w:rPr>
+              <w:t xml:space="preserve">13.2</w:t>
+            </w:r>
+          </w:p>
+        </w:tc>
+        <w:tc>
+          <w:tcPr>
+            <w:tcW w:type="dxa" w:w="6400"/>
+            <w:tcMar>
+              <w:top w:type="dxa" w:w="60"/>
+              <w:left w:type="dxa" w:w="100"/>
+              <w:bottom w:type="dxa" w:w="60"/>
+              <w:right w:type="dxa" w:w="100"/>
+            </w:tcMar>
+          </w:tcPr>
+          <w:p>
+            <w:pPr>
+              <w:spacing w:after="0" w:line="260"/>
+            </w:pPr>
+            <w:r>
+              <w:rPr>
+                <w:b w:val="false"/>
+                <w:bCs w:val="false"/>
+                <w:color w:val="C00000"/>
+                <w:sz w:val="20"/>
+                <w:szCs w:val="20"/>
+              </w:rPr>
+              <w:t xml:space="preserve">Verzicht auf § 19 UStG prüfen — bindet fünf Jahre, bringt Vorsteuerabzug</w:t>
+            </w:r>
+          </w:p>
+        </w:tc>
+        <w:tc>
+          <w:tcPr>
+            <w:tcW w:type="dxa" w:w="1700"/>
+            <w:tcMar>
+              <w:top w:type="dxa" w:w="60"/>
+              <w:left w:type="dxa" w:w="100"/>
+              <w:bottom w:type="dxa" w:w="60"/>
+              <w:right w:type="dxa" w:w="100"/>
+            </w:tcMar>
+          </w:tcPr>
+          <w:p>
+            <w:pPr>
+              <w:spacing w:after="0" w:line="260"/>
+            </w:pPr>
+            <w:r>
+              <w:rPr>
+                <w:b w:val="false"/>
+                <w:bCs w:val="false"/>
+                <w:color w:val="C00000"/>
+                <w:sz w:val="20"/>
+                <w:szCs w:val="20"/>
+              </w:rPr>
+              <w:t xml:space="preserve">Y</w:t>
+            </w:r>
+          </w:p>
+        </w:tc>
+      </w:tr>
+      <w:tr>
+        <w:tc>
+          <w:tcPr>
+            <w:tcW w:type="dxa" w:w="900"/>
+            <w:tcMar>
+              <w:top w:type="dxa" w:w="60"/>
+              <w:left w:type="dxa" w:w="100"/>
+              <w:bottom w:type="dxa" w:w="60"/>
+              <w:right w:type="dxa" w:w="100"/>
+            </w:tcMar>
+          </w:tcPr>
+          <w:p>
+            <w:pPr>
+              <w:spacing w:after="0" w:line="260"/>
+            </w:pPr>
+            <w:r>
+              <w:rPr>
+                <w:b w:val="false"/>
+                <w:bCs w:val="false"/>
+                <w:color w:val="C00000"/>
+                <w:sz w:val="20"/>
+                <w:szCs w:val="20"/>
+              </w:rPr>
+              <w:t xml:space="preserve">13.4</w:t>
+            </w:r>
+          </w:p>
+        </w:tc>
+        <w:tc>
+          <w:tcPr>
+            <w:tcW w:type="dxa" w:w="6400"/>
+            <w:tcMar>
+              <w:top w:type="dxa" w:w="60"/>
+              <w:left w:type="dxa" w:w="100"/>
+              <w:bottom w:type="dxa" w:w="60"/>
+              <w:right w:type="dxa" w:w="100"/>
+            </w:tcMar>
+          </w:tcPr>
+          <w:p>
+            <w:pPr>
+              <w:spacing w:after="0" w:line="260"/>
+            </w:pPr>
+            <w:r>
+              <w:rPr>
+                <w:b w:val="false"/>
+                <w:bCs w:val="false"/>
+                <w:color w:val="C00000"/>
+                <w:sz w:val="20"/>
+                <w:szCs w:val="20"/>
+              </w:rPr>
+              <w:t xml:space="preserve">Claude/Anthropic: Vertrag nach Art. 28 DSGVO. Voraussetzung für das erste Projekt</w:t>
+            </w:r>
+          </w:p>
+        </w:tc>
+        <w:tc>
+          <w:tcPr>
+            <w:tcW w:type="dxa" w:w="1700"/>
+            <w:tcMar>
+              <w:top w:type="dxa" w:w="60"/>
+              <w:left w:type="dxa" w:w="100"/>
+              <w:bottom w:type="dxa" w:w="60"/>
+              <w:right w:type="dxa" w:w="100"/>
+            </w:tcMar>
+          </w:tcPr>
+          <w:p>
+            <w:pPr>
+              <w:spacing w:after="0" w:line="260"/>
+            </w:pPr>
+            <w:r>
+              <w:rPr>
+                <w:b w:val="false"/>
+                <w:bCs w:val="false"/>
+                <w:color w:val="C00000"/>
+                <w:sz w:val="20"/>
+                <w:szCs w:val="20"/>
+              </w:rPr>
+              <w:t xml:space="preserve">K</w:t>
+            </w:r>
+          </w:p>
+        </w:tc>
+      </w:tr>
+      <w:tr>
+        <w:tc>
+          <w:tcPr>
+            <w:tcW w:type="dxa" w:w="900"/>
+            <w:tcMar>
+              <w:top w:type="dxa" w:w="60"/>
+              <w:left w:type="dxa" w:w="100"/>
+              <w:bottom w:type="dxa" w:w="60"/>
+              <w:right w:type="dxa" w:w="100"/>
+            </w:tcMar>
+          </w:tcPr>
+          <w:p>
+            <w:pPr>
+              <w:spacing w:after="0" w:line="260"/>
+            </w:pPr>
+            <w:r>
+              <w:rPr>
+                <w:b w:val="false"/>
+                <w:bCs w:val="false"/>
+                <w:color w:val="C00000"/>
+                <w:sz w:val="20"/>
+                <w:szCs w:val="20"/>
+              </w:rPr>
+              <w:t xml:space="preserve">13.4</w:t>
+            </w:r>
+          </w:p>
+        </w:tc>
+        <w:tc>
+          <w:tcPr>
+            <w:tcW w:type="dxa" w:w="6400"/>
+            <w:tcMar>
+              <w:top w:type="dxa" w:w="60"/>
+              <w:left w:type="dxa" w:w="100"/>
+              <w:bottom w:type="dxa" w:w="60"/>
+              <w:right w:type="dxa" w:w="100"/>
+            </w:tcMar>
+          </w:tcPr>
+          <w:p>
+            <w:pPr>
+              <w:spacing w:after="0" w:line="260"/>
+            </w:pPr>
+            <w:r>
+              <w:rPr>
+                <w:b w:val="false"/>
+                <w:bCs w:val="false"/>
+                <w:color w:val="C00000"/>
+                <w:sz w:val="20"/>
+                <w:szCs w:val="20"/>
+              </w:rPr>
+              <w:t xml:space="preserve">Barrierefreiheit: Betroffenheit nach dem BFSG klären</w:t>
+            </w:r>
+          </w:p>
+        </w:tc>
+        <w:tc>
+          <w:tcPr>
+            <w:tcW w:type="dxa" w:w="1700"/>
+            <w:tcMar>
+              <w:top w:type="dxa" w:w="60"/>
+              <w:left w:type="dxa" w:w="100"/>
+              <w:bottom w:type="dxa" w:w="60"/>
+              <w:right w:type="dxa" w:w="100"/>
+            </w:tcMar>
+          </w:tcPr>
+          <w:p>
+            <w:pPr>
+              <w:spacing w:after="0" w:line="260"/>
+            </w:pPr>
+            <w:r>
+              <w:rPr>
+                <w:b w:val="false"/>
+                <w:bCs w:val="false"/>
+                <w:color w:val="C00000"/>
+                <w:sz w:val="20"/>
+                <w:szCs w:val="20"/>
+              </w:rPr>
+              <w:t xml:space="preserve">K</w:t>
+            </w:r>
+          </w:p>
+        </w:tc>
+      </w:tr>
+      <w:tr>
+        <w:tc>
+          <w:tcPr>
+            <w:tcW w:type="dxa" w:w="900"/>
+            <w:tcMar>
+              <w:top w:type="dxa" w:w="60"/>
+              <w:left w:type="dxa" w:w="100"/>
+              <w:bottom w:type="dxa" w:w="60"/>
+              <w:right w:type="dxa" w:w="100"/>
+            </w:tcMar>
+          </w:tcPr>
+          <w:p>
+            <w:pPr>
+              <w:spacing w:after="0" w:line="260"/>
+            </w:pPr>
+            <w:r>
+              <w:rPr>
+                <w:b w:val="false"/>
+                <w:bCs w:val="false"/>
+                <w:color w:val="C00000"/>
+                <w:sz w:val="20"/>
+                <w:szCs w:val="20"/>
+              </w:rPr>
+              <w:t xml:space="preserve">13.5</w:t>
+            </w:r>
+          </w:p>
+        </w:tc>
+        <w:tc>
+          <w:tcPr>
+            <w:tcW w:type="dxa" w:w="6400"/>
+            <w:tcMar>
+              <w:top w:type="dxa" w:w="60"/>
+              <w:left w:type="dxa" w:w="100"/>
+              <w:bottom w:type="dxa" w:w="60"/>
+              <w:right w:type="dxa" w:w="100"/>
+            </w:tcMar>
+          </w:tcPr>
+          <w:p>
+            <w:pPr>
+              <w:spacing w:after="0" w:line="260"/>
+            </w:pPr>
+            <w:r>
+              <w:rPr>
+                <w:b w:val="false"/>
+                <w:bCs w:val="false"/>
+                <w:color w:val="C00000"/>
+                <w:sz w:val="20"/>
+                <w:szCs w:val="20"/>
+              </w:rPr>
+              <w:t xml:space="preserve">KSK-Aufnahme unsicher, rückwirkende Beitragsnachforderung möglich</w:t>
+            </w:r>
+          </w:p>
+        </w:tc>
+        <w:tc>
+          <w:tcPr>
+            <w:tcW w:type="dxa" w:w="1700"/>
+            <w:tcMar>
+              <w:top w:type="dxa" w:w="60"/>
+              <w:left w:type="dxa" w:w="100"/>
+              <w:bottom w:type="dxa" w:w="60"/>
+              <w:right w:type="dxa" w:w="100"/>
+            </w:tcMar>
+          </w:tcPr>
+          <w:p>
+            <w:pPr>
+              <w:spacing w:after="0" w:line="260"/>
+            </w:pPr>
+            <w:r>
+              <w:rPr>
+                <w:b w:val="false"/>
+                <w:bCs w:val="false"/>
+                <w:color w:val="C00000"/>
+                <w:sz w:val="20"/>
+                <w:szCs w:val="20"/>
+              </w:rPr>
+              <w:t xml:space="preserve">Y</w:t>
+            </w:r>
+          </w:p>
+        </w:tc>
+      </w:tr>
+      <w:tr>
+        <w:tc>
+          <w:tcPr>
+            <w:tcW w:type="dxa" w:w="900"/>
+            <w:tcMar>
+              <w:top w:type="dxa" w:w="60"/>
+              <w:left w:type="dxa" w:w="100"/>
+              <w:bottom w:type="dxa" w:w="60"/>
+              <w:right w:type="dxa" w:w="100"/>
+            </w:tcMar>
+          </w:tcPr>
+          <w:p>
+            <w:pPr>
+              <w:spacing w:after="0" w:line="260"/>
+            </w:pPr>
+            <w:r>
+              <w:rPr>
+                <w:b/>
+                <w:bCs/>
+                <w:color w:val="C00000"/>
+                <w:sz w:val="20"/>
+                <w:szCs w:val="20"/>
+              </w:rPr>
+              <w:t xml:space="preserve">Anhang B</w:t>
+            </w:r>
+          </w:p>
+        </w:tc>
+        <w:tc>
+          <w:tcPr>
+            <w:tcW w:type="dxa" w:w="6400"/>
+            <w:tcMar>
+              <w:top w:type="dxa" w:w="60"/>
+              <w:left w:type="dxa" w:w="100"/>
+              <w:bottom w:type="dxa" w:w="60"/>
+              <w:right w:type="dxa" w:w="100"/>
+            </w:tcMar>
+          </w:tcPr>
+          <w:p>
+            <w:pPr>
+              <w:spacing w:after="0" w:line="260"/>
+            </w:pPr>
+            <w:r>
+              <w:rPr>
+                <w:b/>
+                <w:bCs/>
+                <w:color w:val="C00000"/>
+                <w:sz w:val="20"/>
+                <w:szCs w:val="20"/>
+              </w:rPr>
+              <w:t xml:space="preserve">Ladungsfähige Anschrift — blockiert alle elf fertigen Checks</w:t>
+            </w:r>
+          </w:p>
+        </w:tc>
+        <w:tc>
+          <w:tcPr>
+            <w:tcW w:type="dxa" w:w="1700"/>
+            <w:tcMar>
+              <w:top w:type="dxa" w:w="60"/>
+              <w:left w:type="dxa" w:w="100"/>
+              <w:bottom w:type="dxa" w:w="60"/>
+              <w:right w:type="dxa" w:w="100"/>
+            </w:tcMar>
+          </w:tcPr>
+          <w:p>
+            <w:pPr>
+              <w:spacing w:after="0" w:line="260"/>
+            </w:pPr>
+            <w:r>
+              <w:rPr>
+                <w:b/>
+                <w:bCs/>
+                <w:color w:val="C00000"/>
+                <w:sz w:val="20"/>
+                <w:szCs w:val="20"/>
+              </w:rPr>
+              <w:t xml:space="preserve">K+Y</w:t>
+            </w:r>
+          </w:p>
+        </w:tc>
+      </w:tr>
+    </w:tbl>
+    <w:p>
+      <w:pPr>
+        <w:spacing w:after="120"/>
+      </w:pPr>
+    </w:p>
+    <w:p>
+      <w:pPr>
+        <w:spacing w:after="160" w:line="276"/>
+      </w:pPr>
+      <w:r>
+        <w:rPr>
+          <w:b w:val="false"/>
+          <w:bCs w:val="false"/>
+          <w:i w:val="false"/>
+          <w:iCs w:val="false"/>
+          <w:color w:val="0070C0"/>
+          <w:sz w:val="22"/>
+          <w:szCs w:val="22"/>
+        </w:rPr>
+        <w:t xml:space="preserve">Blau gesetzt ist alles, was im Gespräch vom 16./17.08.2026 neu hinzugekommen ist — das ist rund ein Drittel dieses Dokuments und steht nicht in dieser Übersicht, weil es sonst eine zweite Fassung des Konzepts wäre.</w:t>
+      </w:r>
     </w:p>
     <w:p>
       <w:pPr>

</xml_diff>